<commit_message>
submission: improve title-page hierarchy
</commit_message>
<xml_diff>
--- a/submission-jisrs/JISRS_Title_Page.docx
+++ b/submission-jisrs/JISRS_Title_Page.docx
@@ -5,14 +5,15 @@
     <w:p>
       <w:pPr>
         <w:pStyle w:val="FirstParagraph"/>
-        <w:spacing w:before="0" w:after="0" w:line="240" w:lineRule="auto"/>
+        <w:spacing w:before="0" w:after="100" w:line="240" w:lineRule="auto"/>
+        <w:jc w:val="center"/>
       </w:pPr>
       <w:r>
         <w:rPr>
           <w:rFonts w:ascii="Times New Roman" w:hAnsi="Times New Roman" w:eastAsia="Times New Roman"/>
           <w:b/>
           <w:bCs/>
-          <w:sz w:val="24"/>
+          <w:sz w:val="28"/>
         </w:rPr>
         <w:t xml:space="preserve">Terrain-Conditioned Cross-Attention for Cross-Region Avalanche Debris Mapping with Sentinel-1 SAR</w:t>
       </w:r>
@@ -20,7 +21,8 @@
     <w:p>
       <w:pPr>
         <w:pStyle w:val="BodyText"/>
-        <w:spacing w:before="0" w:after="0" w:line="240" w:lineRule="auto"/>
+        <w:spacing w:before="0" w:after="40" w:line="240" w:lineRule="auto"/>
+        <w:jc w:val="center"/>
       </w:pPr>
       <w:r>
         <w:rPr>
@@ -34,6 +36,7 @@
       <w:r>
         <w:rPr>
           <w:rFonts w:ascii="Times New Roman" w:hAnsi="Times New Roman" w:eastAsia="Times New Roman"/>
+          <w:b/>
           <w:sz w:val="24"/>
           <w:vertAlign w:val="superscript"/>
         </w:rPr>
@@ -42,6 +45,7 @@
       <w:r>
         <w:rPr>
           <w:rFonts w:ascii="Times New Roman" w:hAnsi="Times New Roman" w:eastAsia="Times New Roman"/>
+          <w:b/>
           <w:sz w:val="24"/>
         </w:rPr>
         <w:t xml:space="preserve">,</w:t>
@@ -49,6 +53,7 @@
       <w:r>
         <w:rPr>
           <w:rFonts w:ascii="Times New Roman" w:hAnsi="Times New Roman" w:eastAsia="Times New Roman"/>
+          <w:b/>
           <w:sz w:val="24"/>
         </w:rPr>
         <w:t xml:space="preserve"> </w:t>
@@ -65,6 +70,7 @@
       <w:r>
         <w:rPr>
           <w:rFonts w:ascii="Times New Roman" w:hAnsi="Times New Roman" w:eastAsia="Times New Roman"/>
+          <w:b/>
           <w:sz w:val="24"/>
           <w:vertAlign w:val="superscript"/>
         </w:rPr>
@@ -74,7 +80,8 @@
     <w:p>
       <w:pPr>
         <w:pStyle w:val="BodyText"/>
-        <w:spacing w:before="0" w:after="0" w:line="240" w:lineRule="auto"/>
+        <w:spacing w:before="0" w:after="40" w:line="240" w:lineRule="auto"/>
+        <w:jc w:val="center"/>
       </w:pPr>
       <w:r>
         <w:rPr>
@@ -95,7 +102,8 @@
     <w:p>
       <w:pPr>
         <w:pStyle w:val="BodyText"/>
-        <w:spacing w:before="0" w:after="0" w:line="240" w:lineRule="auto"/>
+        <w:spacing w:before="0" w:after="40" w:line="240" w:lineRule="auto"/>
+        <w:jc w:val="center"/>
       </w:pPr>
       <w:r>
         <w:rPr>
@@ -131,7 +139,7 @@
     <w:p>
       <w:pPr>
         <w:pStyle w:val="BodyText"/>
-        <w:spacing w:before="0" w:after="0" w:line="240" w:lineRule="auto"/>
+        <w:spacing w:before="100" w:after="100" w:line="240" w:lineRule="auto"/>
       </w:pPr>
       <w:r>
         <w:rPr>
@@ -357,12 +365,15 @@
     <w:p>
       <w:pPr>
         <w:pStyle w:val="Heading1"/>
-        <w:spacing w:before="0" w:after="0" w:line="240" w:lineRule="auto"/>
-      </w:pPr>
-      <w:r>
-        <w:rPr>
-          <w:rFonts w:ascii="Times New Roman" w:hAnsi="Times New Roman" w:eastAsia="Times New Roman"/>
-          <w:sz w:val="24"/>
+        <w:keepNext/>
+        <w:spacing w:before="160" w:after="60" w:line="240" w:lineRule="auto"/>
+      </w:pPr>
+      <w:r>
+        <w:rPr>
+          <w:rFonts w:ascii="Times New Roman" w:hAnsi="Times New Roman" w:eastAsia="Times New Roman"/>
+          <w:b/>
+          <w:color w:val="000000"/>
+          <w:sz w:val="26"/>
         </w:rPr>
         <w:t xml:space="preserve">Declarations</w:t>
       </w:r>
@@ -372,11 +383,14 @@
     <w:p>
       <w:pPr>
         <w:pStyle w:val="Heading1"/>
-        <w:spacing w:before="0" w:after="0" w:line="240" w:lineRule="auto"/>
-      </w:pPr>
-      <w:r>
-        <w:rPr>
-          <w:rFonts w:ascii="Times New Roman" w:hAnsi="Times New Roman" w:eastAsia="Times New Roman"/>
+        <w:keepNext/>
+        <w:spacing w:before="140" w:after="40" w:line="240" w:lineRule="auto"/>
+      </w:pPr>
+      <w:r>
+        <w:rPr>
+          <w:rFonts w:ascii="Times New Roman" w:hAnsi="Times New Roman" w:eastAsia="Times New Roman"/>
+          <w:b/>
+          <w:color w:val="000000"/>
           <w:sz w:val="24"/>
         </w:rPr>
         <w:t xml:space="preserve">Conflict of Interest</w:t>
@@ -385,7 +399,7 @@
     <w:p>
       <w:pPr>
         <w:pStyle w:val="FirstParagraph"/>
-        <w:spacing w:before="0" w:after="0" w:line="240" w:lineRule="auto"/>
+        <w:spacing w:before="0" w:after="20" w:line="240" w:lineRule="auto"/>
       </w:pPr>
       <w:r>
         <w:rPr>
@@ -400,11 +414,14 @@
     <w:p>
       <w:pPr>
         <w:pStyle w:val="Heading1"/>
-        <w:spacing w:before="0" w:after="0" w:line="240" w:lineRule="auto"/>
-      </w:pPr>
-      <w:r>
-        <w:rPr>
-          <w:rFonts w:ascii="Times New Roman" w:hAnsi="Times New Roman" w:eastAsia="Times New Roman"/>
+        <w:keepNext/>
+        <w:spacing w:before="140" w:after="40" w:line="240" w:lineRule="auto"/>
+      </w:pPr>
+      <w:r>
+        <w:rPr>
+          <w:rFonts w:ascii="Times New Roman" w:hAnsi="Times New Roman" w:eastAsia="Times New Roman"/>
+          <w:b/>
+          <w:color w:val="000000"/>
           <w:sz w:val="24"/>
         </w:rPr>
         <w:t xml:space="preserve">Funding</w:t>
@@ -413,7 +430,7 @@
     <w:p>
       <w:pPr>
         <w:pStyle w:val="FirstParagraph"/>
-        <w:spacing w:before="0" w:after="0" w:line="240" w:lineRule="auto"/>
+        <w:spacing w:before="0" w:after="20" w:line="240" w:lineRule="auto"/>
       </w:pPr>
       <w:r>
         <w:rPr>
@@ -428,11 +445,14 @@
     <w:p>
       <w:pPr>
         <w:pStyle w:val="Heading1"/>
-        <w:spacing w:before="0" w:after="0" w:line="240" w:lineRule="auto"/>
-      </w:pPr>
-      <w:r>
-        <w:rPr>
-          <w:rFonts w:ascii="Times New Roman" w:hAnsi="Times New Roman" w:eastAsia="Times New Roman"/>
+        <w:keepNext/>
+        <w:spacing w:before="140" w:after="40" w:line="240" w:lineRule="auto"/>
+      </w:pPr>
+      <w:r>
+        <w:rPr>
+          <w:rFonts w:ascii="Times New Roman" w:hAnsi="Times New Roman" w:eastAsia="Times New Roman"/>
+          <w:b/>
+          <w:color w:val="000000"/>
           <w:sz w:val="24"/>
         </w:rPr>
         <w:t xml:space="preserve">Author’s Contribution</w:t>
@@ -441,7 +461,7 @@
     <w:p>
       <w:pPr>
         <w:pStyle w:val="FirstParagraph"/>
-        <w:spacing w:before="0" w:after="0" w:line="240" w:lineRule="auto"/>
+        <w:spacing w:before="0" w:after="20" w:line="240" w:lineRule="auto"/>
       </w:pPr>
       <w:r>
         <w:rPr>
@@ -502,11 +522,14 @@
     <w:p>
       <w:pPr>
         <w:pStyle w:val="Heading1"/>
-        <w:spacing w:before="0" w:after="0" w:line="240" w:lineRule="auto"/>
-      </w:pPr>
-      <w:r>
-        <w:rPr>
-          <w:rFonts w:ascii="Times New Roman" w:hAnsi="Times New Roman" w:eastAsia="Times New Roman"/>
+        <w:keepNext/>
+        <w:spacing w:before="140" w:after="40" w:line="240" w:lineRule="auto"/>
+      </w:pPr>
+      <w:r>
+        <w:rPr>
+          <w:rFonts w:ascii="Times New Roman" w:hAnsi="Times New Roman" w:eastAsia="Times New Roman"/>
+          <w:b/>
+          <w:color w:val="000000"/>
           <w:sz w:val="24"/>
         </w:rPr>
         <w:t xml:space="preserve">Acknowledgement</w:t>
@@ -515,7 +538,7 @@
     <w:p>
       <w:pPr>
         <w:pStyle w:val="FirstParagraph"/>
-        <w:spacing w:before="0" w:after="0" w:line="240" w:lineRule="auto"/>
+        <w:spacing w:before="0" w:after="20" w:line="240" w:lineRule="auto"/>
       </w:pPr>
       <w:r>
         <w:rPr>
@@ -530,11 +553,14 @@
     <w:p>
       <w:pPr>
         <w:pStyle w:val="Heading1"/>
-        <w:spacing w:before="0" w:after="0" w:line="240" w:lineRule="auto"/>
-      </w:pPr>
-      <w:r>
-        <w:rPr>
-          <w:rFonts w:ascii="Times New Roman" w:hAnsi="Times New Roman" w:eastAsia="Times New Roman"/>
+        <w:keepNext/>
+        <w:spacing w:before="140" w:after="40" w:line="240" w:lineRule="auto"/>
+      </w:pPr>
+      <w:r>
+        <w:rPr>
+          <w:rFonts w:ascii="Times New Roman" w:hAnsi="Times New Roman" w:eastAsia="Times New Roman"/>
+          <w:b/>
+          <w:color w:val="000000"/>
           <w:sz w:val="24"/>
         </w:rPr>
         <w:t xml:space="preserve">Ethics Approval and Consent</w:t>
@@ -543,7 +569,7 @@
     <w:p>
       <w:pPr>
         <w:pStyle w:val="FirstParagraph"/>
-        <w:spacing w:before="0" w:after="0" w:line="240" w:lineRule="auto"/>
+        <w:spacing w:before="0" w:after="20" w:line="240" w:lineRule="auto"/>
       </w:pPr>
       <w:r>
         <w:rPr>
@@ -558,11 +584,14 @@
     <w:p>
       <w:pPr>
         <w:pStyle w:val="Heading1"/>
-        <w:spacing w:before="0" w:after="0" w:line="240" w:lineRule="auto"/>
-      </w:pPr>
-      <w:r>
-        <w:rPr>
-          <w:rFonts w:ascii="Times New Roman" w:hAnsi="Times New Roman" w:eastAsia="Times New Roman"/>
+        <w:keepNext/>
+        <w:spacing w:before="140" w:after="40" w:line="240" w:lineRule="auto"/>
+      </w:pPr>
+      <w:r>
+        <w:rPr>
+          <w:rFonts w:ascii="Times New Roman" w:hAnsi="Times New Roman" w:eastAsia="Times New Roman"/>
+          <w:b/>
+          <w:color w:val="000000"/>
           <w:sz w:val="24"/>
         </w:rPr>
         <w:t xml:space="preserve">Consent for Publication</w:t>
@@ -571,7 +600,7 @@
     <w:p>
       <w:pPr>
         <w:pStyle w:val="FirstParagraph"/>
-        <w:spacing w:before="0" w:after="0" w:line="240" w:lineRule="auto"/>
+        <w:spacing w:before="0" w:after="20" w:line="240" w:lineRule="auto"/>
       </w:pPr>
       <w:r>
         <w:rPr>
@@ -586,11 +615,14 @@
     <w:p>
       <w:pPr>
         <w:pStyle w:val="Heading1"/>
-        <w:spacing w:before="0" w:after="0" w:line="240" w:lineRule="auto"/>
-      </w:pPr>
-      <w:r>
-        <w:rPr>
-          <w:rFonts w:ascii="Times New Roman" w:hAnsi="Times New Roman" w:eastAsia="Times New Roman"/>
+        <w:keepNext/>
+        <w:spacing w:before="140" w:after="40" w:line="240" w:lineRule="auto"/>
+      </w:pPr>
+      <w:r>
+        <w:rPr>
+          <w:rFonts w:ascii="Times New Roman" w:hAnsi="Times New Roman" w:eastAsia="Times New Roman"/>
+          <w:b/>
+          <w:color w:val="000000"/>
           <w:sz w:val="24"/>
         </w:rPr>
         <w:t xml:space="preserve">Data and Code Availability</w:t>
@@ -599,7 +631,7 @@
     <w:p>
       <w:pPr>
         <w:pStyle w:val="FirstParagraph"/>
-        <w:spacing w:before="0" w:after="0" w:line="240" w:lineRule="auto"/>
+        <w:spacing w:before="0" w:after="20" w:line="240" w:lineRule="auto"/>
       </w:pPr>
       <w:r>
         <w:rPr>
@@ -658,11 +690,14 @@
     <w:p>
       <w:pPr>
         <w:pStyle w:val="Heading1"/>
-        <w:spacing w:before="0" w:after="0" w:line="240" w:lineRule="auto"/>
-      </w:pPr>
-      <w:r>
-        <w:rPr>
-          <w:rFonts w:ascii="Times New Roman" w:hAnsi="Times New Roman" w:eastAsia="Times New Roman"/>
+        <w:keepNext/>
+        <w:spacing w:before="140" w:after="40" w:line="240" w:lineRule="auto"/>
+      </w:pPr>
+      <w:r>
+        <w:rPr>
+          <w:rFonts w:ascii="Times New Roman" w:hAnsi="Times New Roman" w:eastAsia="Times New Roman"/>
+          <w:b/>
+          <w:color w:val="000000"/>
           <w:sz w:val="24"/>
         </w:rPr>
         <w:t xml:space="preserve">Author Agreement</w:t>
@@ -671,7 +706,7 @@
     <w:p>
       <w:pPr>
         <w:pStyle w:val="FirstParagraph"/>
-        <w:spacing w:before="0" w:after="0" w:line="240" w:lineRule="auto"/>
+        <w:spacing w:before="0" w:after="20" w:line="240" w:lineRule="auto"/>
       </w:pPr>
       <w:r>
         <w:rPr>

</xml_diff>